<commit_message>
directives and approvals save folders edited
</commit_message>
<xml_diff>
--- a/document_templates/docx/act_template.docx
+++ b/document_templates/docx/act_template.docx
@@ -136,7 +136,6 @@
               </w:rPr>
               <w:t>{{</w:t>
             </w:r>
-            <w:proofErr w:type="spellStart"/>
             <w:r>
               <w:rPr>
                 <w:i/>
@@ -159,7 +158,6 @@
               </w:rPr>
               <w:t>stage</w:t>
             </w:r>
-            <w:proofErr w:type="spellEnd"/>
             <w:r>
               <w:rPr>
                 <w:i/>
@@ -190,7 +188,6 @@
               </w:rPr>
               <w:t>{{</w:t>
             </w:r>
-            <w:proofErr w:type="spellStart"/>
             <w:r>
               <w:rPr>
                 <w:i/>
@@ -213,7 +210,6 @@
               </w:rPr>
               <w:t>address</w:t>
             </w:r>
-            <w:proofErr w:type="spellEnd"/>
             <w:r>
               <w:rPr>
                 <w:i/>
@@ -463,7 +459,6 @@
               </w:rPr>
               <w:t>_</w:t>
             </w:r>
-            <w:proofErr w:type="spellStart"/>
             <w:r>
               <w:rPr>
                 <w:i/>
@@ -475,7 +470,6 @@
               </w:rPr>
               <w:t>ogrn</w:t>
             </w:r>
-            <w:proofErr w:type="spellEnd"/>
             <w:r>
               <w:rPr>
                 <w:i/>
@@ -777,7 +771,6 @@
               </w:rPr>
               <w:t>_</w:t>
             </w:r>
-            <w:proofErr w:type="spellStart"/>
             <w:r>
               <w:rPr>
                 <w:i/>
@@ -789,7 +782,6 @@
               </w:rPr>
               <w:t>tel</w:t>
             </w:r>
-            <w:proofErr w:type="spellEnd"/>
             <w:r>
               <w:rPr>
                 <w:i/>
@@ -904,7 +896,6 @@
               </w:rPr>
               <w:t>_</w:t>
             </w:r>
-            <w:proofErr w:type="spellStart"/>
             <w:r>
               <w:rPr>
                 <w:i/>
@@ -916,7 +907,6 @@
               </w:rPr>
               <w:t>sro</w:t>
             </w:r>
-            <w:proofErr w:type="spellEnd"/>
             <w:r>
               <w:rPr>
                 <w:i/>
@@ -1041,7 +1031,6 @@
               </w:rPr>
               <w:t>_</w:t>
             </w:r>
-            <w:proofErr w:type="spellStart"/>
             <w:r>
               <w:rPr>
                 <w:i/>
@@ -1053,7 +1042,6 @@
               </w:rPr>
               <w:t>sro</w:t>
             </w:r>
-            <w:proofErr w:type="spellEnd"/>
             <w:r>
               <w:rPr>
                 <w:i/>
@@ -1064,7 +1052,6 @@
               </w:rPr>
               <w:t>_</w:t>
             </w:r>
-            <w:proofErr w:type="spellStart"/>
             <w:r>
               <w:rPr>
                 <w:i/>
@@ -1076,7 +1063,6 @@
               </w:rPr>
               <w:t>ogrn</w:t>
             </w:r>
-            <w:proofErr w:type="spellEnd"/>
             <w:r>
               <w:rPr>
                 <w:i/>
@@ -1170,7 +1156,6 @@
               </w:rPr>
               <w:t>_</w:t>
             </w:r>
-            <w:proofErr w:type="spellStart"/>
             <w:r>
               <w:rPr>
                 <w:i/>
@@ -1182,7 +1167,6 @@
               </w:rPr>
               <w:t>sro</w:t>
             </w:r>
-            <w:proofErr w:type="spellEnd"/>
             <w:r>
               <w:rPr>
                 <w:i/>
@@ -1507,7 +1491,6 @@
               </w:rPr>
               <w:t>_</w:t>
             </w:r>
-            <w:proofErr w:type="spellStart"/>
             <w:r>
               <w:rPr>
                 <w:i/>
@@ -1519,7 +1502,6 @@
               </w:rPr>
               <w:t>ogrn</w:t>
             </w:r>
-            <w:proofErr w:type="spellEnd"/>
             <w:r>
               <w:rPr>
                 <w:i/>
@@ -1781,7 +1763,6 @@
               </w:rPr>
               <w:t>_</w:t>
             </w:r>
-            <w:proofErr w:type="spellStart"/>
             <w:r>
               <w:rPr>
                 <w:i/>
@@ -1793,7 +1774,6 @@
               </w:rPr>
               <w:t>tel</w:t>
             </w:r>
-            <w:proofErr w:type="spellEnd"/>
             <w:r>
               <w:rPr>
                 <w:i/>
@@ -1888,7 +1868,6 @@
               </w:rPr>
               <w:t>_</w:t>
             </w:r>
-            <w:proofErr w:type="spellStart"/>
             <w:r>
               <w:rPr>
                 <w:i/>
@@ -1900,7 +1879,6 @@
               </w:rPr>
               <w:t>sro</w:t>
             </w:r>
-            <w:proofErr w:type="spellEnd"/>
             <w:r>
               <w:rPr>
                 <w:i/>
@@ -1995,7 +1973,6 @@
               </w:rPr>
               <w:t>_</w:t>
             </w:r>
-            <w:proofErr w:type="spellStart"/>
             <w:r>
               <w:rPr>
                 <w:i/>
@@ -2007,7 +1984,6 @@
               </w:rPr>
               <w:t>sro</w:t>
             </w:r>
-            <w:proofErr w:type="spellEnd"/>
             <w:r>
               <w:rPr>
                 <w:i/>
@@ -2039,7 +2015,6 @@
               </w:rPr>
               <w:t>_</w:t>
             </w:r>
-            <w:proofErr w:type="spellStart"/>
             <w:r>
               <w:rPr>
                 <w:i/>
@@ -2051,7 +2026,6 @@
               </w:rPr>
               <w:t>ogrn</w:t>
             </w:r>
-            <w:proofErr w:type="spellEnd"/>
             <w:r>
               <w:rPr>
                 <w:i/>
@@ -2125,7 +2099,6 @@
               </w:rPr>
               <w:t>_</w:t>
             </w:r>
-            <w:proofErr w:type="spellStart"/>
             <w:r>
               <w:rPr>
                 <w:i/>
@@ -2137,7 +2110,6 @@
               </w:rPr>
               <w:t>sro</w:t>
             </w:r>
-            <w:proofErr w:type="spellEnd"/>
             <w:r>
               <w:rPr>
                 <w:i/>
@@ -2405,7 +2377,6 @@
               </w:rPr>
               <w:t>_</w:t>
             </w:r>
-            <w:proofErr w:type="spellStart"/>
             <w:r>
               <w:rPr>
                 <w:i/>
@@ -2417,7 +2388,6 @@
               </w:rPr>
               <w:t>ogrn</w:t>
             </w:r>
-            <w:proofErr w:type="spellEnd"/>
             <w:r>
               <w:rPr>
                 <w:i/>
@@ -2669,7 +2639,6 @@
               </w:rPr>
               <w:t>_</w:t>
             </w:r>
-            <w:proofErr w:type="spellStart"/>
             <w:r>
               <w:rPr>
                 <w:i/>
@@ -2681,7 +2650,6 @@
               </w:rPr>
               <w:t>sro</w:t>
             </w:r>
-            <w:proofErr w:type="spellEnd"/>
             <w:r>
               <w:rPr>
                 <w:i/>
@@ -2776,7 +2744,6 @@
               </w:rPr>
               <w:t>_</w:t>
             </w:r>
-            <w:proofErr w:type="spellStart"/>
             <w:r>
               <w:rPr>
                 <w:i/>
@@ -2788,7 +2755,6 @@
               </w:rPr>
               <w:t>sro</w:t>
             </w:r>
-            <w:proofErr w:type="spellEnd"/>
             <w:r>
               <w:rPr>
                 <w:i/>
@@ -2820,7 +2786,6 @@
               </w:rPr>
               <w:t>_</w:t>
             </w:r>
-            <w:proofErr w:type="spellStart"/>
             <w:r>
               <w:rPr>
                 <w:i/>
@@ -2832,7 +2797,6 @@
               </w:rPr>
               <w:t>ogrn</w:t>
             </w:r>
-            <w:proofErr w:type="spellEnd"/>
             <w:r>
               <w:rPr>
                 <w:i/>
@@ -2906,7 +2870,6 @@
               </w:rPr>
               <w:t>_</w:t>
             </w:r>
-            <w:proofErr w:type="spellStart"/>
             <w:r>
               <w:rPr>
                 <w:i/>
@@ -2918,7 +2881,6 @@
               </w:rPr>
               <w:t>sro</w:t>
             </w:r>
-            <w:proofErr w:type="spellEnd"/>
             <w:r>
               <w:rPr>
                 <w:i/>
@@ -3135,7 +3097,6 @@
               </w:rPr>
               <w:t>{{</w:t>
             </w:r>
-            <w:proofErr w:type="spellStart"/>
             <w:r>
               <w:rPr>
                 <w:b/>
@@ -3154,18 +3115,7 @@
                 <w:szCs w:val="24"/>
                 <w:lang w:val="en-US"/>
               </w:rPr>
-              <w:t>_name</w:t>
-            </w:r>
-            <w:proofErr w:type="spellEnd"/>
-            <w:r>
-              <w:rPr>
-                <w:b/>
-                <w:bCs/>
-                <w:sz w:val="24"/>
-                <w:szCs w:val="24"/>
-                <w:lang w:val="en-US"/>
-              </w:rPr>
-              <w:t>}}</w:t>
+              <w:t>_name}}</w:t>
             </w:r>
           </w:p>
         </w:tc>
@@ -3225,7 +3175,6 @@
               </w:rPr>
               <w:t>{{</w:t>
             </w:r>
-            <w:proofErr w:type="spellStart"/>
             <w:r>
               <w:rPr>
                 <w:b/>
@@ -3236,7 +3185,6 @@
               </w:rPr>
               <w:t>a_dd</w:t>
             </w:r>
-            <w:proofErr w:type="spellEnd"/>
             <w:r>
               <w:rPr>
                 <w:b/>
@@ -3300,29 +3248,7 @@
                 <w:szCs w:val="24"/>
                 <w:lang w:val="en-US"/>
               </w:rPr>
-              <w:t>{{</w:t>
-            </w:r>
-            <w:proofErr w:type="spellStart"/>
-            <w:r>
-              <w:rPr>
-                <w:b/>
-                <w:bCs/>
-                <w:sz w:val="24"/>
-                <w:szCs w:val="24"/>
-                <w:lang w:val="en-US"/>
-              </w:rPr>
-              <w:t>a_mm</w:t>
-            </w:r>
-            <w:proofErr w:type="spellEnd"/>
-            <w:r>
-              <w:rPr>
-                <w:b/>
-                <w:bCs/>
-                <w:sz w:val="24"/>
-                <w:szCs w:val="24"/>
-                <w:lang w:val="en-US"/>
-              </w:rPr>
-              <w:t>}}</w:t>
+              <w:t>{{a_mm}}</w:t>
             </w:r>
           </w:p>
         </w:tc>
@@ -3378,7 +3304,6 @@
               </w:rPr>
               <w:t>{{</w:t>
             </w:r>
-            <w:proofErr w:type="spellStart"/>
             <w:r>
               <w:rPr>
                 <w:b/>
@@ -3397,18 +3322,7 @@
                 <w:szCs w:val="24"/>
                 <w:lang w:val="en-US"/>
               </w:rPr>
-              <w:t>_yy</w:t>
-            </w:r>
-            <w:proofErr w:type="spellEnd"/>
-            <w:r>
-              <w:rPr>
-                <w:b/>
-                <w:bCs/>
-                <w:sz w:val="24"/>
-                <w:szCs w:val="24"/>
-                <w:lang w:val="en-US"/>
-              </w:rPr>
-              <w:t>}}</w:t>
+              <w:t>_yy}}</w:t>
             </w:r>
             <w:r>
               <w:rPr>
@@ -3433,15 +3347,6 @@
                 <w:szCs w:val="24"/>
               </w:rPr>
             </w:pPr>
-            <w:r>
-              <w:rPr>
-                <w:b/>
-                <w:bCs/>
-                <w:sz w:val="24"/>
-                <w:szCs w:val="24"/>
-              </w:rPr>
-              <w:t>г.</w:t>
-            </w:r>
           </w:p>
         </w:tc>
       </w:tr>
@@ -3753,7 +3658,6 @@
         </w:rPr>
         <w:t>_</w:t>
       </w:r>
-      <w:proofErr w:type="spellStart"/>
       <w:r>
         <w:rPr>
           <w:i/>
@@ -3765,7 +3669,6 @@
         </w:rPr>
         <w:t>fio</w:t>
       </w:r>
-      <w:proofErr w:type="spellEnd"/>
       <w:r>
         <w:rPr>
           <w:i/>
@@ -3838,7 +3741,6 @@
         </w:rPr>
         <w:t>_</w:t>
       </w:r>
-      <w:proofErr w:type="spellStart"/>
       <w:r>
         <w:rPr>
           <w:i/>
@@ -3850,7 +3752,6 @@
         </w:rPr>
         <w:t>nrs</w:t>
       </w:r>
-      <w:proofErr w:type="spellEnd"/>
       <w:r>
         <w:rPr>
           <w:i/>
@@ -3944,7 +3845,6 @@
         </w:rPr>
         <w:t>_</w:t>
       </w:r>
-      <w:proofErr w:type="spellStart"/>
       <w:r>
         <w:rPr>
           <w:i/>
@@ -3956,7 +3856,6 @@
         </w:rPr>
         <w:t>nrs</w:t>
       </w:r>
-      <w:proofErr w:type="spellEnd"/>
       <w:r>
         <w:rPr>
           <w:i/>
@@ -3996,7 +3895,7 @@
           <w:szCs w:val="22"/>
           <w:u w:val="single"/>
         </w:rPr>
-        <w:t>г.</w:t>
+        <w:t xml:space="preserve">, приказ </w:t>
       </w:r>
       <w:r>
         <w:rPr>
@@ -4006,7 +3905,7 @@
           <w:szCs w:val="22"/>
           <w:u w:val="single"/>
         </w:rPr>
-        <w:t xml:space="preserve">, приказ </w:t>
+        <w:t>№</w:t>
       </w:r>
       <w:r>
         <w:rPr>
@@ -4016,7 +3915,7 @@
           <w:szCs w:val="22"/>
           <w:u w:val="single"/>
         </w:rPr>
-        <w:t>№</w:t>
+        <w:t>{{</w:t>
       </w:r>
       <w:r>
         <w:rPr>
@@ -4025,6 +3924,100 @@
           <w:sz w:val="22"/>
           <w:szCs w:val="22"/>
           <w:u w:val="single"/>
+          <w:lang w:val="en-US"/>
+        </w:rPr>
+        <w:t>tech</w:t>
+      </w:r>
+      <w:r>
+        <w:rPr>
+          <w:i/>
+          <w:color w:val="000000"/>
+          <w:sz w:val="22"/>
+          <w:szCs w:val="22"/>
+          <w:u w:val="single"/>
+        </w:rPr>
+        <w:t>_</w:t>
+      </w:r>
+      <w:r>
+        <w:rPr>
+          <w:i/>
+          <w:color w:val="000000"/>
+          <w:sz w:val="22"/>
+          <w:szCs w:val="22"/>
+          <w:u w:val="single"/>
+          <w:lang w:val="en-US"/>
+        </w:rPr>
+        <w:t>customer</w:t>
+      </w:r>
+      <w:r>
+        <w:rPr>
+          <w:i/>
+          <w:color w:val="000000"/>
+          <w:sz w:val="22"/>
+          <w:szCs w:val="22"/>
+          <w:u w:val="single"/>
+        </w:rPr>
+        <w:t>_</w:t>
+      </w:r>
+      <w:r>
+        <w:rPr>
+          <w:i/>
+          <w:color w:val="000000"/>
+          <w:sz w:val="22"/>
+          <w:szCs w:val="22"/>
+          <w:u w:val="single"/>
+          <w:lang w:val="en-US"/>
+        </w:rPr>
+        <w:t>directive</w:t>
+      </w:r>
+      <w:r>
+        <w:rPr>
+          <w:i/>
+          <w:color w:val="000000"/>
+          <w:sz w:val="22"/>
+          <w:szCs w:val="22"/>
+          <w:u w:val="single"/>
+        </w:rPr>
+        <w:t>_</w:t>
+      </w:r>
+      <w:r>
+        <w:rPr>
+          <w:i/>
+          <w:color w:val="000000"/>
+          <w:sz w:val="22"/>
+          <w:szCs w:val="22"/>
+          <w:u w:val="single"/>
+          <w:lang w:val="en-US"/>
+        </w:rPr>
+        <w:t>number</w:t>
+      </w:r>
+      <w:r>
+        <w:rPr>
+          <w:i/>
+          <w:color w:val="000000"/>
+          <w:sz w:val="22"/>
+          <w:szCs w:val="22"/>
+          <w:u w:val="single"/>
+        </w:rPr>
+        <w:t>}}</w:t>
+      </w:r>
+      <w:r>
+        <w:rPr>
+          <w:i/>
+          <w:color w:val="000000"/>
+          <w:sz w:val="22"/>
+          <w:szCs w:val="22"/>
+          <w:u w:val="single"/>
+        </w:rPr>
+        <w:t xml:space="preserve"> от </w:t>
+      </w:r>
+      <w:r>
+        <w:rPr>
+          <w:i/>
+          <w:color w:val="000000"/>
+          <w:sz w:val="22"/>
+          <w:szCs w:val="22"/>
+          <w:u w:val="single"/>
         </w:rPr>
         <w:t>{{</w:t>
       </w:r>
@@ -4100,7 +4093,7 @@
           <w:u w:val="single"/>
           <w:lang w:val="en-US"/>
         </w:rPr>
-        <w:t>number</w:t>
+        <w:t>date</w:t>
       </w:r>
       <w:r>
         <w:rPr>
@@ -4111,120 +4104,6 @@
           <w:u w:val="single"/>
         </w:rPr>
         <w:t>}}</w:t>
-      </w:r>
-      <w:r>
-        <w:rPr>
-          <w:i/>
-          <w:color w:val="000000"/>
-          <w:sz w:val="22"/>
-          <w:szCs w:val="22"/>
-          <w:u w:val="single"/>
-        </w:rPr>
-        <w:t xml:space="preserve"> от </w:t>
-      </w:r>
-      <w:r>
-        <w:rPr>
-          <w:i/>
-          <w:color w:val="000000"/>
-          <w:sz w:val="22"/>
-          <w:szCs w:val="22"/>
-          <w:u w:val="single"/>
-        </w:rPr>
-        <w:t>{{</w:t>
-      </w:r>
-      <w:r>
-        <w:rPr>
-          <w:i/>
-          <w:color w:val="000000"/>
-          <w:sz w:val="22"/>
-          <w:szCs w:val="22"/>
-          <w:u w:val="single"/>
-          <w:lang w:val="en-US"/>
-        </w:rPr>
-        <w:t>tech</w:t>
-      </w:r>
-      <w:r>
-        <w:rPr>
-          <w:i/>
-          <w:color w:val="000000"/>
-          <w:sz w:val="22"/>
-          <w:szCs w:val="22"/>
-          <w:u w:val="single"/>
-        </w:rPr>
-        <w:t>_</w:t>
-      </w:r>
-      <w:r>
-        <w:rPr>
-          <w:i/>
-          <w:color w:val="000000"/>
-          <w:sz w:val="22"/>
-          <w:szCs w:val="22"/>
-          <w:u w:val="single"/>
-          <w:lang w:val="en-US"/>
-        </w:rPr>
-        <w:t>customer</w:t>
-      </w:r>
-      <w:r>
-        <w:rPr>
-          <w:i/>
-          <w:color w:val="000000"/>
-          <w:sz w:val="22"/>
-          <w:szCs w:val="22"/>
-          <w:u w:val="single"/>
-        </w:rPr>
-        <w:t>_</w:t>
-      </w:r>
-      <w:r>
-        <w:rPr>
-          <w:i/>
-          <w:color w:val="000000"/>
-          <w:sz w:val="22"/>
-          <w:szCs w:val="22"/>
-          <w:u w:val="single"/>
-          <w:lang w:val="en-US"/>
-        </w:rPr>
-        <w:t>directive</w:t>
-      </w:r>
-      <w:r>
-        <w:rPr>
-          <w:i/>
-          <w:color w:val="000000"/>
-          <w:sz w:val="22"/>
-          <w:szCs w:val="22"/>
-          <w:u w:val="single"/>
-        </w:rPr>
-        <w:t>_</w:t>
-      </w:r>
-      <w:r>
-        <w:rPr>
-          <w:i/>
-          <w:color w:val="000000"/>
-          <w:sz w:val="22"/>
-          <w:szCs w:val="22"/>
-          <w:u w:val="single"/>
-          <w:lang w:val="en-US"/>
-        </w:rPr>
-        <w:t>date</w:t>
-      </w:r>
-      <w:r>
-        <w:rPr>
-          <w:i/>
-          <w:color w:val="000000"/>
-          <w:sz w:val="22"/>
-          <w:szCs w:val="22"/>
-          <w:u w:val="single"/>
-        </w:rPr>
-        <w:t>}}</w:t>
-      </w:r>
-      <w:r>
-        <w:rPr>
-          <w:i/>
-          <w:color w:val="000000"/>
-          <w:sz w:val="22"/>
-          <w:szCs w:val="22"/>
-          <w:u w:val="single"/>
-        </w:rPr>
-        <w:t>г.</w:t>
       </w:r>
       <w:r>
         <w:rPr>
@@ -4367,7 +4246,6 @@
         </w:rPr>
         <w:t>{{</w:t>
       </w:r>
-      <w:proofErr w:type="spellStart"/>
       <w:r>
         <w:rPr>
           <w:i/>
@@ -4445,7 +4323,6 @@
         </w:rPr>
         <w:t>full</w:t>
       </w:r>
-      <w:proofErr w:type="spellEnd"/>
       <w:r>
         <w:rPr>
           <w:i/>
@@ -4500,7 +4377,6 @@
         </w:rPr>
         <w:t>{{</w:t>
       </w:r>
-      <w:proofErr w:type="spellStart"/>
       <w:r>
         <w:rPr>
           <w:i/>
@@ -4578,7 +4454,6 @@
         </w:rPr>
         <w:t>ogrn</w:t>
       </w:r>
-      <w:proofErr w:type="spellEnd"/>
       <w:r>
         <w:rPr>
           <w:i/>
@@ -4633,7 +4508,6 @@
         </w:rPr>
         <w:t>{{</w:t>
       </w:r>
-      <w:proofErr w:type="spellStart"/>
       <w:r>
         <w:rPr>
           <w:i/>
@@ -4711,7 +4585,6 @@
         </w:rPr>
         <w:t>inn</w:t>
       </w:r>
-      <w:proofErr w:type="spellEnd"/>
       <w:r>
         <w:rPr>
           <w:i/>
@@ -4743,31 +4616,7 @@
           <w:u w:val="single"/>
           <w:lang w:val="en-US"/>
         </w:rPr>
-        <w:t>{{</w:t>
-      </w:r>
-      <w:proofErr w:type="spellStart"/>
-      <w:r>
-        <w:rPr>
-          <w:i/>
-          <w:color w:val="000000"/>
-          <w:sz w:val="22"/>
-          <w:szCs w:val="22"/>
-          <w:u w:val="single"/>
-          <w:lang w:val="en-US"/>
-        </w:rPr>
-        <w:t>tech_customer_org_address</w:t>
-      </w:r>
-      <w:proofErr w:type="spellEnd"/>
-      <w:r>
-        <w:rPr>
-          <w:i/>
-          <w:color w:val="000000"/>
-          <w:sz w:val="22"/>
-          <w:szCs w:val="22"/>
-          <w:u w:val="single"/>
-          <w:lang w:val="en-US"/>
-        </w:rPr>
-        <w:t>}</w:t>
+        <w:t>{{tech_customer_org_address}</w:t>
       </w:r>
       <w:r>
         <w:rPr>
@@ -5022,7 +4871,6 @@
         </w:rPr>
         <w:t>_</w:t>
       </w:r>
-      <w:proofErr w:type="spellStart"/>
       <w:r>
         <w:rPr>
           <w:i/>
@@ -5032,7 +4880,6 @@
         </w:rPr>
         <w:t>fio</w:t>
       </w:r>
-      <w:proofErr w:type="spellEnd"/>
       <w:r>
         <w:rPr>
           <w:i/>
@@ -5092,7 +4939,6 @@
         </w:rPr>
         <w:t>_</w:t>
       </w:r>
-      <w:proofErr w:type="spellStart"/>
       <w:r>
         <w:rPr>
           <w:i/>
@@ -5102,7 +4948,6 @@
         </w:rPr>
         <w:t>nrs</w:t>
       </w:r>
-      <w:proofErr w:type="spellEnd"/>
       <w:r>
         <w:rPr>
           <w:i/>
@@ -5288,31 +5133,13 @@
         </w:rPr>
         <w:t>date</w:t>
       </w:r>
-      <w:proofErr w:type="gramStart"/>
-      <w:r>
-        <w:rPr>
-          <w:i/>
-          <w:sz w:val="22"/>
-          <w:u w:val="single"/>
-        </w:rPr>
-        <w:t>}}</w:t>
-      </w:r>
-      <w:r>
-        <w:rPr>
-          <w:i/>
-          <w:sz w:val="22"/>
-          <w:u w:val="single"/>
-        </w:rPr>
-        <w:t>г.</w:t>
-      </w:r>
-      <w:proofErr w:type="gramEnd"/>
-      <w:r>
-        <w:rPr>
-          <w:i/>
-          <w:sz w:val="22"/>
-          <w:u w:val="single"/>
-        </w:rPr>
-        <w:t xml:space="preserve"> {{</w:t>
+      <w:r>
+        <w:rPr>
+          <w:i/>
+          <w:sz w:val="22"/>
+          <w:u w:val="single"/>
+        </w:rPr>
+        <w:t>}} {{</w:t>
       </w:r>
       <w:r>
         <w:rPr>
@@ -5622,19 +5449,83 @@
           <w:szCs w:val="22"/>
           <w:u w:val="single"/>
         </w:rPr>
-        <w:t>{</w:t>
-      </w:r>
-      <w:proofErr w:type="spellStart"/>
-      <w:r>
-        <w:rPr>
-          <w:i/>
-          <w:sz w:val="22"/>
-          <w:szCs w:val="22"/>
-          <w:u w:val="single"/>
+        <w:t>{builder_</w:t>
+      </w:r>
+      <w:r>
+        <w:rPr>
+          <w:i/>
+          <w:sz w:val="22"/>
+          <w:szCs w:val="22"/>
+          <w:u w:val="single"/>
+          <w:lang w:val="en-US"/>
+        </w:rPr>
+        <w:t>control</w:t>
+      </w:r>
+      <w:r>
+        <w:rPr>
+          <w:i/>
+          <w:sz w:val="22"/>
+          <w:szCs w:val="22"/>
+          <w:u w:val="single"/>
+        </w:rPr>
+        <w:t>_</w:t>
+      </w:r>
+      <w:r>
+        <w:rPr>
+          <w:i/>
+          <w:sz w:val="22"/>
+          <w:szCs w:val="22"/>
+          <w:u w:val="single"/>
+          <w:lang w:val="en-US"/>
+        </w:rPr>
+        <w:t>fio</w:t>
+      </w:r>
+      <w:r>
+        <w:rPr>
+          <w:i/>
+          <w:sz w:val="22"/>
+          <w:szCs w:val="22"/>
+          <w:u w:val="single"/>
+        </w:rPr>
+        <w:t>}}</w:t>
+      </w:r>
+      <w:r>
+        <w:rPr>
+          <w:i/>
+          <w:sz w:val="22"/>
+          <w:szCs w:val="22"/>
+          <w:u w:val="single"/>
+        </w:rPr>
+        <w:t>,</w:t>
+      </w:r>
+      <w:r>
+        <w:rPr>
+          <w:i/>
+          <w:sz w:val="22"/>
+          <w:szCs w:val="22"/>
+          <w:u w:val="single"/>
+        </w:rPr>
+        <w:t xml:space="preserve"> </w:t>
+      </w:r>
+      <w:r>
+        <w:rPr>
+          <w:i/>
+          <w:sz w:val="22"/>
+          <w:szCs w:val="22"/>
+          <w:u w:val="single"/>
+        </w:rPr>
+        <w:t>{{</w:t>
+      </w:r>
+      <w:r>
+        <w:rPr>
+          <w:i/>
+          <w:sz w:val="22"/>
+          <w:szCs w:val="22"/>
+          <w:u w:val="single"/>
+          <w:lang w:val="en-US"/>
         </w:rPr>
         <w:t>builder</w:t>
       </w:r>
-      <w:proofErr w:type="spellEnd"/>
       <w:r>
         <w:rPr>
           <w:i/>
@@ -5663,18 +5554,35 @@
         </w:rPr>
         <w:t>_</w:t>
       </w:r>
-      <w:proofErr w:type="spellStart"/>
-      <w:r>
-        <w:rPr>
-          <w:i/>
-          <w:sz w:val="22"/>
-          <w:szCs w:val="22"/>
-          <w:u w:val="single"/>
-          <w:lang w:val="en-US"/>
-        </w:rPr>
-        <w:t>fio</w:t>
-      </w:r>
-      <w:proofErr w:type="spellEnd"/>
+      <w:r>
+        <w:rPr>
+          <w:i/>
+          <w:sz w:val="22"/>
+          <w:szCs w:val="22"/>
+          <w:u w:val="single"/>
+          <w:lang w:val="en-US"/>
+        </w:rPr>
+        <w:t>nrs</w:t>
+      </w:r>
+      <w:r>
+        <w:rPr>
+          <w:i/>
+          <w:sz w:val="22"/>
+          <w:szCs w:val="22"/>
+          <w:u w:val="single"/>
+        </w:rPr>
+        <w:t>_</w:t>
+      </w:r>
+      <w:r>
+        <w:rPr>
+          <w:i/>
+          <w:sz w:val="22"/>
+          <w:szCs w:val="22"/>
+          <w:u w:val="single"/>
+          <w:lang w:val="en-US"/>
+        </w:rPr>
+        <w:t>number</w:t>
+      </w:r>
       <w:r>
         <w:rPr>
           <w:i/>
@@ -5691,16 +5599,7 @@
           <w:szCs w:val="22"/>
           <w:u w:val="single"/>
         </w:rPr>
-        <w:t>,</w:t>
-      </w:r>
-      <w:r>
-        <w:rPr>
-          <w:i/>
-          <w:sz w:val="22"/>
-          <w:szCs w:val="22"/>
-          <w:u w:val="single"/>
-        </w:rPr>
-        <w:t xml:space="preserve"> </w:t>
+        <w:t xml:space="preserve"> от </w:t>
       </w:r>
       <w:r>
         <w:rPr>
@@ -5749,7 +5648,6 @@
         </w:rPr>
         <w:t>_</w:t>
       </w:r>
-      <w:proofErr w:type="spellStart"/>
       <w:r>
         <w:rPr>
           <w:i/>
@@ -5760,7 +5658,100 @@
         </w:rPr>
         <w:t>nrs</w:t>
       </w:r>
-      <w:proofErr w:type="spellEnd"/>
+      <w:r>
+        <w:rPr>
+          <w:i/>
+          <w:sz w:val="22"/>
+          <w:szCs w:val="22"/>
+          <w:u w:val="single"/>
+        </w:rPr>
+        <w:t>_</w:t>
+      </w:r>
+      <w:r>
+        <w:rPr>
+          <w:i/>
+          <w:sz w:val="22"/>
+          <w:szCs w:val="22"/>
+          <w:u w:val="single"/>
+          <w:lang w:val="en-US"/>
+        </w:rPr>
+        <w:t>date</w:t>
+      </w:r>
+      <w:r>
+        <w:rPr>
+          <w:i/>
+          <w:sz w:val="22"/>
+          <w:szCs w:val="22"/>
+          <w:u w:val="single"/>
+        </w:rPr>
+        <w:t>}}</w:t>
+      </w:r>
+      <w:r>
+        <w:rPr>
+          <w:i/>
+          <w:sz w:val="22"/>
+          <w:szCs w:val="22"/>
+          <w:u w:val="single"/>
+        </w:rPr>
+        <w:t>, приказ №</w:t>
+      </w:r>
+      <w:r>
+        <w:rPr>
+          <w:i/>
+          <w:sz w:val="22"/>
+          <w:szCs w:val="22"/>
+          <w:u w:val="single"/>
+        </w:rPr>
+        <w:t>{{</w:t>
+      </w:r>
+      <w:r>
+        <w:rPr>
+          <w:i/>
+          <w:sz w:val="22"/>
+          <w:szCs w:val="22"/>
+          <w:u w:val="single"/>
+          <w:lang w:val="en-US"/>
+        </w:rPr>
+        <w:t>builder</w:t>
+      </w:r>
+      <w:r>
+        <w:rPr>
+          <w:i/>
+          <w:sz w:val="22"/>
+          <w:szCs w:val="22"/>
+          <w:u w:val="single"/>
+        </w:rPr>
+        <w:t>_</w:t>
+      </w:r>
+      <w:r>
+        <w:rPr>
+          <w:i/>
+          <w:sz w:val="22"/>
+          <w:szCs w:val="22"/>
+          <w:u w:val="single"/>
+          <w:lang w:val="en-US"/>
+        </w:rPr>
+        <w:t>control</w:t>
+      </w:r>
+      <w:r>
+        <w:rPr>
+          <w:i/>
+          <w:sz w:val="22"/>
+          <w:szCs w:val="22"/>
+          <w:u w:val="single"/>
+        </w:rPr>
+        <w:t>_</w:t>
+      </w:r>
+      <w:r>
+        <w:rPr>
+          <w:i/>
+          <w:sz w:val="22"/>
+          <w:szCs w:val="22"/>
+          <w:u w:val="single"/>
+          <w:lang w:val="en-US"/>
+        </w:rPr>
+        <w:t>directive</w:t>
+      </w:r>
       <w:r>
         <w:rPr>
           <w:i/>
@@ -5845,18 +5836,16 @@
         </w:rPr>
         <w:t>_</w:t>
       </w:r>
-      <w:proofErr w:type="spellStart"/>
-      <w:r>
-        <w:rPr>
-          <w:i/>
-          <w:sz w:val="22"/>
-          <w:szCs w:val="22"/>
-          <w:u w:val="single"/>
-          <w:lang w:val="en-US"/>
-        </w:rPr>
-        <w:t>nrs</w:t>
-      </w:r>
-      <w:proofErr w:type="spellEnd"/>
+      <w:r>
+        <w:rPr>
+          <w:i/>
+          <w:sz w:val="22"/>
+          <w:szCs w:val="22"/>
+          <w:u w:val="single"/>
+          <w:lang w:val="en-US"/>
+        </w:rPr>
+        <w:t>directive</w:t>
+      </w:r>
       <w:r>
         <w:rPr>
           <w:i/>
@@ -5884,203 +5873,6 @@
           <w:u w:val="single"/>
         </w:rPr>
         <w:t>}}</w:t>
-      </w:r>
-      <w:r>
-        <w:rPr>
-          <w:i/>
-          <w:sz w:val="22"/>
-          <w:szCs w:val="22"/>
-          <w:u w:val="single"/>
-        </w:rPr>
-        <w:t>, приказ №</w:t>
-      </w:r>
-      <w:r>
-        <w:rPr>
-          <w:i/>
-          <w:sz w:val="22"/>
-          <w:szCs w:val="22"/>
-          <w:u w:val="single"/>
-        </w:rPr>
-        <w:t>{{</w:t>
-      </w:r>
-      <w:r>
-        <w:rPr>
-          <w:i/>
-          <w:sz w:val="22"/>
-          <w:szCs w:val="22"/>
-          <w:u w:val="single"/>
-          <w:lang w:val="en-US"/>
-        </w:rPr>
-        <w:t>builder</w:t>
-      </w:r>
-      <w:r>
-        <w:rPr>
-          <w:i/>
-          <w:sz w:val="22"/>
-          <w:szCs w:val="22"/>
-          <w:u w:val="single"/>
-        </w:rPr>
-        <w:t>_</w:t>
-      </w:r>
-      <w:r>
-        <w:rPr>
-          <w:i/>
-          <w:sz w:val="22"/>
-          <w:szCs w:val="22"/>
-          <w:u w:val="single"/>
-          <w:lang w:val="en-US"/>
-        </w:rPr>
-        <w:t>control</w:t>
-      </w:r>
-      <w:r>
-        <w:rPr>
-          <w:i/>
-          <w:sz w:val="22"/>
-          <w:szCs w:val="22"/>
-          <w:u w:val="single"/>
-        </w:rPr>
-        <w:t>_</w:t>
-      </w:r>
-      <w:r>
-        <w:rPr>
-          <w:i/>
-          <w:sz w:val="22"/>
-          <w:szCs w:val="22"/>
-          <w:u w:val="single"/>
-          <w:lang w:val="en-US"/>
-        </w:rPr>
-        <w:t>directive</w:t>
-      </w:r>
-      <w:r>
-        <w:rPr>
-          <w:i/>
-          <w:sz w:val="22"/>
-          <w:szCs w:val="22"/>
-          <w:u w:val="single"/>
-        </w:rPr>
-        <w:t>_</w:t>
-      </w:r>
-      <w:r>
-        <w:rPr>
-          <w:i/>
-          <w:sz w:val="22"/>
-          <w:szCs w:val="22"/>
-          <w:u w:val="single"/>
-          <w:lang w:val="en-US"/>
-        </w:rPr>
-        <w:t>number</w:t>
-      </w:r>
-      <w:r>
-        <w:rPr>
-          <w:i/>
-          <w:sz w:val="22"/>
-          <w:szCs w:val="22"/>
-          <w:u w:val="single"/>
-        </w:rPr>
-        <w:t>}}</w:t>
-      </w:r>
-      <w:r>
-        <w:rPr>
-          <w:i/>
-          <w:sz w:val="22"/>
-          <w:szCs w:val="22"/>
-          <w:u w:val="single"/>
-        </w:rPr>
-        <w:t xml:space="preserve"> от </w:t>
-      </w:r>
-      <w:r>
-        <w:rPr>
-          <w:i/>
-          <w:sz w:val="22"/>
-          <w:szCs w:val="22"/>
-          <w:u w:val="single"/>
-        </w:rPr>
-        <w:t>{{</w:t>
-      </w:r>
-      <w:r>
-        <w:rPr>
-          <w:i/>
-          <w:sz w:val="22"/>
-          <w:szCs w:val="22"/>
-          <w:u w:val="single"/>
-          <w:lang w:val="en-US"/>
-        </w:rPr>
-        <w:t>builder</w:t>
-      </w:r>
-      <w:r>
-        <w:rPr>
-          <w:i/>
-          <w:sz w:val="22"/>
-          <w:szCs w:val="22"/>
-          <w:u w:val="single"/>
-        </w:rPr>
-        <w:t>_</w:t>
-      </w:r>
-      <w:r>
-        <w:rPr>
-          <w:i/>
-          <w:sz w:val="22"/>
-          <w:szCs w:val="22"/>
-          <w:u w:val="single"/>
-          <w:lang w:val="en-US"/>
-        </w:rPr>
-        <w:t>control</w:t>
-      </w:r>
-      <w:r>
-        <w:rPr>
-          <w:i/>
-          <w:sz w:val="22"/>
-          <w:szCs w:val="22"/>
-          <w:u w:val="single"/>
-        </w:rPr>
-        <w:t>_</w:t>
-      </w:r>
-      <w:r>
-        <w:rPr>
-          <w:i/>
-          <w:sz w:val="22"/>
-          <w:szCs w:val="22"/>
-          <w:u w:val="single"/>
-          <w:lang w:val="en-US"/>
-        </w:rPr>
-        <w:t>directive</w:t>
-      </w:r>
-      <w:r>
-        <w:rPr>
-          <w:i/>
-          <w:sz w:val="22"/>
-          <w:szCs w:val="22"/>
-          <w:u w:val="single"/>
-        </w:rPr>
-        <w:t>_</w:t>
-      </w:r>
-      <w:r>
-        <w:rPr>
-          <w:i/>
-          <w:sz w:val="22"/>
-          <w:szCs w:val="22"/>
-          <w:u w:val="single"/>
-          <w:lang w:val="en-US"/>
-        </w:rPr>
-        <w:t>date</w:t>
-      </w:r>
-      <w:r>
-        <w:rPr>
-          <w:i/>
-          <w:sz w:val="22"/>
-          <w:szCs w:val="22"/>
-          <w:u w:val="single"/>
-        </w:rPr>
-        <w:t>}}</w:t>
-      </w:r>
-      <w:r>
-        <w:rPr>
-          <w:i/>
-          <w:sz w:val="22"/>
-          <w:szCs w:val="22"/>
-          <w:u w:val="single"/>
-        </w:rPr>
-        <w:t>г.</w:t>
       </w:r>
       <w:r>
         <w:rPr>
@@ -6391,7 +6183,6 @@
         </w:rPr>
         <w:t>_</w:t>
       </w:r>
-      <w:proofErr w:type="spellStart"/>
       <w:r>
         <w:rPr>
           <w:i/>
@@ -6401,7 +6192,6 @@
         </w:rPr>
         <w:t>fio</w:t>
       </w:r>
-      <w:proofErr w:type="spellEnd"/>
       <w:r>
         <w:rPr>
           <w:i/>
@@ -6584,14 +6374,6 @@
           <w:sz w:val="22"/>
           <w:u w:val="single"/>
         </w:rPr>
-        <w:t>г.</w:t>
-      </w:r>
-      <w:r>
-        <w:rPr>
-          <w:i/>
-          <w:sz w:val="22"/>
-          <w:u w:val="single"/>
-        </w:rPr>
         <w:t xml:space="preserve"> </w:t>
       </w:r>
       <w:r>
@@ -6737,7 +6519,6 @@
         </w:rPr>
         <w:t>_</w:t>
       </w:r>
-      <w:proofErr w:type="spellStart"/>
       <w:r>
         <w:rPr>
           <w:i/>
@@ -6747,7 +6528,6 @@
         </w:rPr>
         <w:t>ogrn</w:t>
       </w:r>
-      <w:proofErr w:type="spellEnd"/>
       <w:r>
         <w:rPr>
           <w:i/>
@@ -7091,7 +6871,6 @@
         </w:rPr>
         <w:t>{{</w:t>
       </w:r>
-      <w:proofErr w:type="spellStart"/>
       <w:r>
         <w:rPr>
           <w:i/>
@@ -7162,7 +6941,6 @@
         </w:rPr>
         <w:t>full</w:t>
       </w:r>
-      <w:proofErr w:type="spellEnd"/>
       <w:r>
         <w:rPr>
           <w:i/>
@@ -7194,7 +6972,6 @@
         </w:rPr>
         <w:t>{{</w:t>
       </w:r>
-      <w:proofErr w:type="spellStart"/>
       <w:r>
         <w:rPr>
           <w:i/>
@@ -7245,7 +7022,6 @@
         </w:rPr>
         <w:t>fio</w:t>
       </w:r>
-      <w:proofErr w:type="spellEnd"/>
       <w:r>
         <w:rPr>
           <w:i/>
@@ -7293,7 +7069,6 @@
         </w:rPr>
         <w:t>{{</w:t>
       </w:r>
-      <w:proofErr w:type="spellStart"/>
       <w:r>
         <w:rPr>
           <w:i/>
@@ -7357,7 +7132,6 @@
         </w:rPr>
         <w:t>number</w:t>
       </w:r>
-      <w:proofErr w:type="spellEnd"/>
       <w:r>
         <w:rPr>
           <w:i/>
@@ -7402,7 +7176,6 @@
         </w:rPr>
         <w:t>{{</w:t>
       </w:r>
-      <w:proofErr w:type="spellStart"/>
       <w:r>
         <w:rPr>
           <w:i/>
@@ -7466,7 +7239,6 @@
         </w:rPr>
         <w:t>date</w:t>
       </w:r>
-      <w:proofErr w:type="spellEnd"/>
       <w:r>
         <w:rPr>
           <w:i/>
@@ -7523,7 +7295,6 @@
         </w:rPr>
         <w:t>{{</w:t>
       </w:r>
-      <w:proofErr w:type="spellStart"/>
       <w:r>
         <w:rPr>
           <w:i/>
@@ -7594,7 +7365,6 @@
         </w:rPr>
         <w:t>orgn</w:t>
       </w:r>
-      <w:proofErr w:type="spellEnd"/>
       <w:r>
         <w:rPr>
           <w:i/>
@@ -7644,7 +7414,6 @@
         </w:rPr>
         <w:t>{{</w:t>
       </w:r>
-      <w:proofErr w:type="spellStart"/>
       <w:r>
         <w:rPr>
           <w:i/>
@@ -7715,7 +7484,6 @@
         </w:rPr>
         <w:t>inn</w:t>
       </w:r>
-      <w:proofErr w:type="spellEnd"/>
       <w:r>
         <w:rPr>
           <w:i/>
@@ -7744,29 +7512,7 @@
           <w:u w:val="single"/>
           <w:lang w:val="en-US"/>
         </w:rPr>
-        <w:t>{{</w:t>
-      </w:r>
-      <w:proofErr w:type="spellStart"/>
-      <w:r>
-        <w:rPr>
-          <w:i/>
-          <w:iCs/>
-          <w:sz w:val="22"/>
-          <w:u w:val="single"/>
-          <w:lang w:val="en-US"/>
-        </w:rPr>
-        <w:t>contractor_rep_org_address</w:t>
-      </w:r>
-      <w:proofErr w:type="spellEnd"/>
-      <w:r>
-        <w:rPr>
-          <w:i/>
-          <w:iCs/>
-          <w:sz w:val="22"/>
-          <w:u w:val="single"/>
-          <w:lang w:val="en-US"/>
-        </w:rPr>
-        <w:t>}}</w:t>
+        <w:t>{{contractor_rep_org_address}}</w:t>
       </w:r>
     </w:p>
     <w:p>
@@ -8036,7 +7782,6 @@
         </w:rPr>
         <w:t>_</w:t>
       </w:r>
-      <w:proofErr w:type="spellStart"/>
       <w:r>
         <w:rPr>
           <w:i/>
@@ -8047,7 +7792,6 @@
         </w:rPr>
         <w:t>fio</w:t>
       </w:r>
-      <w:proofErr w:type="spellEnd"/>
       <w:r>
         <w:rPr>
           <w:i/>
@@ -8236,34 +7980,14 @@
         </w:rPr>
         <w:t>date</w:t>
       </w:r>
-      <w:proofErr w:type="gramStart"/>
-      <w:r>
-        <w:rPr>
-          <w:i/>
-          <w:sz w:val="22"/>
-          <w:szCs w:val="22"/>
-          <w:u w:val="single"/>
-        </w:rPr>
-        <w:t>}}</w:t>
-      </w:r>
-      <w:r>
-        <w:rPr>
-          <w:i/>
-          <w:sz w:val="22"/>
-          <w:szCs w:val="22"/>
-          <w:u w:val="single"/>
-        </w:rPr>
-        <w:t>г.</w:t>
-      </w:r>
-      <w:proofErr w:type="gramEnd"/>
-      <w:r>
-        <w:rPr>
-          <w:i/>
-          <w:sz w:val="22"/>
-          <w:szCs w:val="22"/>
-          <w:u w:val="single"/>
-        </w:rPr>
-        <w:t xml:space="preserve"> {{</w:t>
+      <w:r>
+        <w:rPr>
+          <w:i/>
+          <w:sz w:val="22"/>
+          <w:szCs w:val="22"/>
+          <w:u w:val="single"/>
+        </w:rPr>
+        <w:t>}} {{</w:t>
       </w:r>
       <w:r>
         <w:rPr>
@@ -8918,7 +8642,6 @@
               </w:rPr>
               <w:t>b</w:t>
             </w:r>
-            <w:proofErr w:type="spellStart"/>
             <w:r>
               <w:rPr>
                 <w:i/>
@@ -8929,7 +8652,6 @@
               </w:rPr>
               <w:t>uilder</w:t>
             </w:r>
-            <w:proofErr w:type="spellEnd"/>
             <w:r>
               <w:rPr>
                 <w:i/>
@@ -9392,27 +9114,7 @@
                 <w:szCs w:val="22"/>
                 <w:lang w:val="en-US"/>
               </w:rPr>
-              <w:t>{{</w:t>
-            </w:r>
-            <w:proofErr w:type="spellStart"/>
-            <w:r>
-              <w:rPr>
-                <w:i/>
-                <w:sz w:val="22"/>
-                <w:szCs w:val="22"/>
-                <w:lang w:val="en-US"/>
-              </w:rPr>
-              <w:t>s_dd</w:t>
-            </w:r>
-            <w:proofErr w:type="spellEnd"/>
-            <w:r>
-              <w:rPr>
-                <w:i/>
-                <w:sz w:val="22"/>
-                <w:szCs w:val="22"/>
-                <w:lang w:val="en-US"/>
-              </w:rPr>
-              <w:t>}}</w:t>
+              <w:t>{{s_dd}}</w:t>
             </w:r>
           </w:p>
         </w:tc>
@@ -9476,27 +9178,7 @@
                 <w:szCs w:val="22"/>
                 <w:lang w:val="en-US"/>
               </w:rPr>
-              <w:t>{{</w:t>
-            </w:r>
-            <w:proofErr w:type="spellStart"/>
-            <w:r>
-              <w:rPr>
-                <w:i/>
-                <w:sz w:val="22"/>
-                <w:szCs w:val="22"/>
-                <w:lang w:val="en-US"/>
-              </w:rPr>
-              <w:t>s_mm</w:t>
-            </w:r>
-            <w:proofErr w:type="spellEnd"/>
-            <w:r>
-              <w:rPr>
-                <w:i/>
-                <w:sz w:val="22"/>
-                <w:szCs w:val="22"/>
-                <w:lang w:val="en-US"/>
-              </w:rPr>
-              <w:t>}}</w:t>
+              <w:t>{{s_mm}}</w:t>
             </w:r>
           </w:p>
         </w:tc>
@@ -9577,7 +9259,6 @@
               </w:rPr>
               <w:t>_</w:t>
             </w:r>
-            <w:proofErr w:type="spellStart"/>
             <w:r>
               <w:rPr>
                 <w:i/>
@@ -9587,7 +9268,6 @@
               </w:rPr>
               <w:t>yy</w:t>
             </w:r>
-            <w:proofErr w:type="spellEnd"/>
             <w:r>
               <w:rPr>
                 <w:i/>
@@ -9740,27 +9420,7 @@
                 <w:szCs w:val="22"/>
                 <w:lang w:val="en-US"/>
               </w:rPr>
-              <w:t>{{</w:t>
-            </w:r>
-            <w:proofErr w:type="spellStart"/>
-            <w:r>
-              <w:rPr>
-                <w:i/>
-                <w:sz w:val="22"/>
-                <w:szCs w:val="22"/>
-                <w:lang w:val="en-US"/>
-              </w:rPr>
-              <w:t>e_dd</w:t>
-            </w:r>
-            <w:proofErr w:type="spellEnd"/>
-            <w:r>
-              <w:rPr>
-                <w:i/>
-                <w:sz w:val="22"/>
-                <w:szCs w:val="22"/>
-                <w:lang w:val="en-US"/>
-              </w:rPr>
-              <w:t>}}</w:t>
+              <w:t>{{e_dd}}</w:t>
             </w:r>
           </w:p>
         </w:tc>
@@ -9824,27 +9484,7 @@
                 <w:szCs w:val="22"/>
                 <w:lang w:val="en-US"/>
               </w:rPr>
-              <w:t>{{</w:t>
-            </w:r>
-            <w:proofErr w:type="spellStart"/>
-            <w:r>
-              <w:rPr>
-                <w:i/>
-                <w:sz w:val="22"/>
-                <w:szCs w:val="22"/>
-                <w:lang w:val="en-US"/>
-              </w:rPr>
-              <w:t>e_mm</w:t>
-            </w:r>
-            <w:proofErr w:type="spellEnd"/>
-            <w:r>
-              <w:rPr>
-                <w:i/>
-                <w:sz w:val="22"/>
-                <w:szCs w:val="22"/>
-                <w:lang w:val="en-US"/>
-              </w:rPr>
-              <w:t>}}</w:t>
+              <w:t>{{e_mm}}</w:t>
             </w:r>
           </w:p>
         </w:tc>
@@ -9898,7 +9538,6 @@
                 <w:i/>
                 <w:sz w:val="22"/>
                 <w:szCs w:val="22"/>
-                <w:lang w:val="en-US"/>
               </w:rPr>
             </w:pPr>
             <w:r>
@@ -9908,27 +9547,7 @@
                 <w:szCs w:val="22"/>
                 <w:lang w:val="en-US"/>
               </w:rPr>
-              <w:t>{{</w:t>
-            </w:r>
-            <w:proofErr w:type="spellStart"/>
-            <w:r>
-              <w:rPr>
-                <w:i/>
-                <w:sz w:val="22"/>
-                <w:szCs w:val="22"/>
-                <w:lang w:val="en-US"/>
-              </w:rPr>
-              <w:t>e_yy</w:t>
-            </w:r>
-            <w:proofErr w:type="spellEnd"/>
-            <w:r>
-              <w:rPr>
-                <w:i/>
-                <w:sz w:val="22"/>
-                <w:szCs w:val="22"/>
-                <w:lang w:val="en-US"/>
-              </w:rPr>
-              <w:t>}}</w:t>
+              <w:t>{{e_yy}}</w:t>
             </w:r>
           </w:p>
         </w:tc>
@@ -11187,7 +10806,6 @@
               </w:rPr>
               <w:t>_</w:t>
             </w:r>
-            <w:proofErr w:type="spellStart"/>
             <w:r>
               <w:rPr>
                 <w:i/>
@@ -11198,7 +10816,6 @@
               </w:rPr>
               <w:t>fio</w:t>
             </w:r>
-            <w:proofErr w:type="spellEnd"/>
             <w:r>
               <w:rPr>
                 <w:i/>
@@ -11360,23 +10977,7 @@
                 <w:i/>
                 <w:sz w:val="22"/>
               </w:rPr>
-              <w:t>{{</w:t>
-            </w:r>
-            <w:proofErr w:type="spellStart"/>
-            <w:r>
-              <w:rPr>
-                <w:i/>
-                <w:sz w:val="22"/>
-              </w:rPr>
-              <w:t>builder_rep_fio</w:t>
-            </w:r>
-            <w:proofErr w:type="spellEnd"/>
-            <w:r>
-              <w:rPr>
-                <w:i/>
-                <w:sz w:val="22"/>
-              </w:rPr>
-              <w:t>}}</w:t>
+              <w:t>{{builder_rep_fio}}</w:t>
             </w:r>
           </w:p>
         </w:tc>
@@ -11618,25 +11219,7 @@
                 <w:sz w:val="22"/>
                 <w:szCs w:val="22"/>
               </w:rPr>
-              <w:t>{{</w:t>
-            </w:r>
-            <w:proofErr w:type="spellStart"/>
-            <w:r>
-              <w:rPr>
-                <w:i/>
-                <w:sz w:val="22"/>
-                <w:szCs w:val="22"/>
-              </w:rPr>
-              <w:t>builder</w:t>
-            </w:r>
-            <w:proofErr w:type="spellEnd"/>
-            <w:r>
-              <w:rPr>
-                <w:i/>
-                <w:sz w:val="22"/>
-                <w:szCs w:val="22"/>
-              </w:rPr>
-              <w:t>_</w:t>
+              <w:t>{{builder_</w:t>
             </w:r>
             <w:r>
               <w:rPr>
@@ -11653,25 +11236,7 @@
                 <w:sz w:val="22"/>
                 <w:szCs w:val="22"/>
               </w:rPr>
-              <w:t>_</w:t>
-            </w:r>
-            <w:proofErr w:type="spellStart"/>
-            <w:r>
-              <w:rPr>
-                <w:i/>
-                <w:sz w:val="22"/>
-                <w:szCs w:val="22"/>
-              </w:rPr>
-              <w:t>fio</w:t>
-            </w:r>
-            <w:proofErr w:type="spellEnd"/>
-            <w:r>
-              <w:rPr>
-                <w:i/>
-                <w:sz w:val="22"/>
-                <w:szCs w:val="22"/>
-              </w:rPr>
-              <w:t>}}</w:t>
+              <w:t>_fio}}</w:t>
             </w:r>
           </w:p>
         </w:tc>
@@ -11823,25 +11388,7 @@
                 <w:sz w:val="22"/>
                 <w:szCs w:val="22"/>
               </w:rPr>
-              <w:t>{{</w:t>
-            </w:r>
-            <w:proofErr w:type="spellStart"/>
-            <w:r>
-              <w:rPr>
-                <w:i/>
-                <w:sz w:val="22"/>
-                <w:szCs w:val="22"/>
-              </w:rPr>
-              <w:t>design_rep_fio</w:t>
-            </w:r>
-            <w:proofErr w:type="spellEnd"/>
-            <w:r>
-              <w:rPr>
-                <w:i/>
-                <w:sz w:val="22"/>
-                <w:szCs w:val="22"/>
-              </w:rPr>
-              <w:t>}}</w:t>
+              <w:t>{{design_rep_fio}}</w:t>
             </w:r>
           </w:p>
         </w:tc>
@@ -12003,25 +11550,7 @@
                 <w:sz w:val="22"/>
                 <w:szCs w:val="22"/>
               </w:rPr>
-              <w:t>{{</w:t>
-            </w:r>
-            <w:proofErr w:type="spellStart"/>
-            <w:r>
-              <w:rPr>
-                <w:i/>
-                <w:sz w:val="22"/>
-                <w:szCs w:val="22"/>
-              </w:rPr>
-              <w:t>contractor_rep_fio</w:t>
-            </w:r>
-            <w:proofErr w:type="spellEnd"/>
-            <w:r>
-              <w:rPr>
-                <w:i/>
-                <w:sz w:val="22"/>
-                <w:szCs w:val="22"/>
-              </w:rPr>
-              <w:t>}}</w:t>
+              <w:t>{{contractor_rep_fio}}</w:t>
             </w:r>
           </w:p>
         </w:tc>
@@ -12163,27 +11692,7 @@
                 <w:szCs w:val="22"/>
                 <w:u w:val="single"/>
               </w:rPr>
-              <w:t>{{</w:t>
-            </w:r>
-            <w:proofErr w:type="spellStart"/>
-            <w:r>
-              <w:rPr>
-                <w:i/>
-                <w:sz w:val="22"/>
-                <w:szCs w:val="22"/>
-                <w:u w:val="single"/>
-              </w:rPr>
-              <w:t>other_rep_fio</w:t>
-            </w:r>
-            <w:proofErr w:type="spellEnd"/>
-            <w:r>
-              <w:rPr>
-                <w:i/>
-                <w:sz w:val="22"/>
-                <w:szCs w:val="22"/>
-                <w:u w:val="single"/>
-              </w:rPr>
-              <w:t>}}</w:t>
+              <w:t>{{other_rep_fio}}</w:t>
             </w:r>
           </w:p>
         </w:tc>

</xml_diff>